<commit_message>
fix: Correct formatting and alignment in executive report documents
</commit_message>
<xml_diff>
--- a/02-phase2/docs/executive_report.docx
+++ b/02-phase2/docs/executive_report.docx
@@ -29306,8 +29306,8 @@
           <w:lang w:val="es-GT"/>
         </w:rPr>
       </w:pPr>
-      <w:bookmarkStart w:id="67" w:name="_Toc225111267"/>
-      <w:bookmarkStart w:id="68" w:name="_Toc226654936"/>
+      <w:bookmarkStart w:id="67" w:name="_Toc226654936"/>
+      <w:bookmarkStart w:id="68" w:name="_Toc225111267"/>
       <w:r>
         <w:rPr>
           <w:lang w:val="es-GT"/>
@@ -29315,7 +29315,7 @@
         <w:lastRenderedPageBreak/>
         <w:t>Diagrama de Arquitectura de Infraestructura</w:t>
       </w:r>
-      <w:bookmarkEnd w:id="68"/>
+      <w:bookmarkEnd w:id="67"/>
     </w:p>
     <w:p>
       <w:pPr>
@@ -29394,7 +29394,7 @@
         <w:lastRenderedPageBreak/>
         <w:t>Herramientas de Gestión Seleccionadas — ERP y CRM</w:t>
       </w:r>
-      <w:bookmarkEnd w:id="67"/>
+      <w:bookmarkEnd w:id="68"/>
       <w:bookmarkEnd w:id="69"/>
     </w:p>
     <w:p>
@@ -33704,19 +33704,7 @@
         <w:rPr>
           <w:lang w:val="es-GT"/>
         </w:rPr>
-        <w:t xml:space="preserve">Durante </w:t>
-      </w:r>
-      <w:r>
-        <w:rPr>
-          <w:lang w:val="es-GT"/>
-        </w:rPr>
-        <w:t>el</w:t>
-      </w:r>
-      <w:r>
-        <w:rPr>
-          <w:lang w:val="es-GT"/>
-        </w:rPr>
-        <w:t xml:space="preserve"> proyecto, se implementaron y configuraron los siguientes módulos funcionales dentro de la plataforma </w:t>
+        <w:t xml:space="preserve">Durante el proyecto, se implementaron y configuraron los siguientes módulos funcionales dentro de la plataforma </w:t>
       </w:r>
       <w:proofErr w:type="spellStart"/>
       <w:r>
@@ -38220,13 +38208,6 @@
           <w:lang w:val="es-GT"/>
         </w:rPr>
       </w:pPr>
-      <w:r>
-        <w:rPr>
-          <w:bCs/>
-          <w:lang w:val="es-GT"/>
-        </w:rPr>
-        <w:t>\</w:t>
-      </w:r>
     </w:p>
     <w:p>
       <w:pPr>
@@ -41866,7 +41847,7 @@
         </w:rPr>
         <w:lastRenderedPageBreak/>
         <w:drawing>
-          <wp:inline distT="0" distB="0" distL="0" distR="0" wp14:anchorId="0815EF03" wp14:editId="4C7EF153">
+          <wp:inline distT="0" distB="0" distL="0" distR="0" wp14:anchorId="0815EF03" wp14:editId="4B4C3117">
             <wp:extent cx="4076700" cy="2069966"/>
             <wp:effectExtent l="0" t="0" r="0" b="6985"/>
             <wp:docPr id="1408051031" name="Picture 42"/>
@@ -41917,7 +41898,7 @@
           <w:noProof/>
         </w:rPr>
         <w:drawing>
-          <wp:inline distT="0" distB="0" distL="0" distR="0" wp14:anchorId="3CFCCF93" wp14:editId="49B40CC0">
+          <wp:inline distT="0" distB="0" distL="0" distR="0" wp14:anchorId="3CFCCF93" wp14:editId="12F49030">
             <wp:extent cx="4086225" cy="2078878"/>
             <wp:effectExtent l="0" t="0" r="0" b="0"/>
             <wp:docPr id="1166022011" name="Picture 43"/>
@@ -41968,7 +41949,7 @@
           <w:noProof/>
         </w:rPr>
         <w:drawing>
-          <wp:inline distT="0" distB="0" distL="0" distR="0" wp14:anchorId="1B59ED21" wp14:editId="63EADA7C">
+          <wp:inline distT="0" distB="0" distL="0" distR="0" wp14:anchorId="1B59ED21" wp14:editId="0C04105E">
             <wp:extent cx="4170888" cy="2104390"/>
             <wp:effectExtent l="0" t="0" r="1270" b="0"/>
             <wp:docPr id="1556812609" name="Picture 44"/>
@@ -42019,7 +42000,7 @@
           <w:noProof/>
         </w:rPr>
         <w:drawing>
-          <wp:inline distT="0" distB="0" distL="0" distR="0" wp14:anchorId="43CCBC89" wp14:editId="2069A66B">
+          <wp:inline distT="0" distB="0" distL="0" distR="0" wp14:anchorId="43CCBC89" wp14:editId="6B7BEB70">
             <wp:extent cx="4267672" cy="2188210"/>
             <wp:effectExtent l="0" t="0" r="0" b="2540"/>
             <wp:docPr id="979738348" name="Picture 45"/>
@@ -49089,6 +49070,7 @@
   <w:style w:type="character" w:default="1" w:styleId="Fuentedeprrafopredeter">
     <w:name w:val="Default Paragraph Font"/>
     <w:uiPriority w:val="1"/>
+    <w:semiHidden/>
     <w:unhideWhenUsed/>
   </w:style>
   <w:style w:type="table" w:default="1" w:styleId="Tablanormal">

</xml_diff>